<commit_message>
Simplify hospital form header and update template
</commit_message>
<xml_diff>
--- a/template.docx
+++ b/template.docx
@@ -4200,7 +4200,7 @@
           </mc:Choice>
           <mc:Fallback>
             <w:pict>
-              <v:group w14:anchorId="19ED2F89" id="Group 1" o:spid="_x0000_s1026" style="position:absolute;margin-left:0;margin-top:0;width:595.1pt;height:841.85pt;z-index:-251658232;mso-wrap-distance-left:0;mso-wrap-distance-right:0;mso-position-horizontal-relative:page;mso-position-vertical-relative:page;mso-height-relative:margin" coordsize="75579,106920" o:gfxdata="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">
+              <v:group w14:anchorId="796347B6" id="Group 1" o:spid="_x0000_s1026" style="position:absolute;margin-left:0;margin-top:0;width:595.1pt;height:841.85pt;z-index:-251658232;mso-wrap-distance-left:0;mso-wrap-distance-right:0;mso-position-horizontal-relative:page;mso-position-vertical-relative:page;mso-height-relative:margin" coordsize="75579,106920" o:gfxdata="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">
                 <v:shapetype id="_x0000_t75" coordsize="21600,21600" o:spt="75" o:preferrelative="t" path="m@4@5l@4@11@9@11@9@5xe" filled="f" stroked="f">
                   <v:stroke joinstyle="miter"/>
                   <v:formulas>
@@ -4436,37 +4436,10 @@
     </w:p>
     <w:p>
       <w:pPr>
-        <w:ind w:left="761"/>
         <w:rPr>
-          <w:sz w:val="29"/>
-          <w:szCs w:val="18"/>
+          <w:sz w:val="33"/>
         </w:rPr>
       </w:pPr>
-      <w:r>
-        <w:rPr>
-          <w:color w:val="030385"/>
-          <w:spacing w:val="-2"/>
-          <w:sz w:val="33"/>
-        </w:rPr>
-        <w:t>Date:</w:t>
-      </w:r>
-      <w:r>
-        <w:rPr>
-          <w:color w:val="030385"/>
-          <w:spacing w:val="-2"/>
-          <w:sz w:val="33"/>
-        </w:rPr>
-        <w:t xml:space="preserve"> </w:t>
-      </w:r>
-      <w:r>
-        <w:rPr>
-          <w:color w:val="030385"/>
-          <w:spacing w:val="-2"/>
-          <w:sz w:val="29"/>
-          <w:szCs w:val="18"/>
-        </w:rPr>
-        <w:t>{{date}}</w:t>
-      </w:r>
     </w:p>
     <w:p>
       <w:pPr>
@@ -4492,6 +4465,151 @@
           <w:sz w:val="33"/>
         </w:rPr>
       </w:pPr>
+      <w:r>
+        <w:rPr>
+          <w:noProof/>
+        </w:rPr>
+        <mc:AlternateContent>
+          <mc:Choice Requires="wps">
+            <w:drawing>
+              <wp:anchor distT="0" distB="0" distL="114300" distR="114300" simplePos="0" relativeHeight="251664384" behindDoc="0" locked="0" layoutInCell="0" allowOverlap="1" wp14:anchorId="5848C102" wp14:editId="1C57DE8D">
+                <wp:simplePos x="0" y="0"/>
+                <wp:positionH relativeFrom="page">
+                  <wp:posOffset>4851400</wp:posOffset>
+                </wp:positionH>
+                <wp:positionV relativeFrom="page">
+                  <wp:posOffset>2705100</wp:posOffset>
+                </wp:positionV>
+                <wp:extent cx="2273300" cy="330200"/>
+                <wp:effectExtent l="0" t="0" r="0" b="0"/>
+                <wp:wrapNone/>
+                <wp:docPr id="1912421292" name="Textbox 71"/>
+                <wp:cNvGraphicFramePr xmlns:a="http://schemas.openxmlformats.org/drawingml/2006/main"/>
+                <a:graphic xmlns:a="http://schemas.openxmlformats.org/drawingml/2006/main">
+                  <a:graphicData uri="http://schemas.microsoft.com/office/word/2010/wordprocessingShape">
+                    <wps:wsp>
+                      <wps:cNvSpPr txBox="1"/>
+                      <wps:spPr>
+                        <a:xfrm>
+                          <a:off x="0" y="0"/>
+                          <a:ext cx="2273300" cy="330200"/>
+                        </a:xfrm>
+                        <a:prstGeom prst="rect">
+                          <a:avLst/>
+                        </a:prstGeom>
+                      </wps:spPr>
+                      <wps:txbx>
+                        <w:txbxContent>
+                          <w:p>
+                            <w:pPr>
+                              <w:ind w:left="761"/>
+                              <w:rPr>
+                                <w:sz w:val="29"/>
+                                <w:szCs w:val="18"/>
+                              </w:rPr>
+                            </w:pPr>
+                            <w:r>
+                              <w:rPr>
+                                <w:color w:val="030385"/>
+                                <w:spacing w:val="-2"/>
+                                <w:sz w:val="33"/>
+                              </w:rPr>
+                              <w:t xml:space="preserve">Date: </w:t>
+                            </w:r>
+                            <w:r>
+                              <w:rPr>
+                                <w:color w:val="030385"/>
+                                <w:spacing w:val="-2"/>
+                                <w:sz w:val="29"/>
+                                <w:szCs w:val="18"/>
+                              </w:rPr>
+                              <w:t>{{date}}</w:t>
+                            </w:r>
+                          </w:p>
+                          <w:p>
+                            <w:pPr>
+                              <w:spacing w:before="24" w:line="290" w:lineRule="auto"/>
+                              <w:ind w:right="680" w:firstLine="299"/>
+                              <w:rPr>
+                                <w:rFonts w:asciiTheme="minorHAnsi" w:hAnsiTheme="minorHAnsi" w:cstheme="minorHAnsi"/>
+                                <w:sz w:val="24"/>
+                                <w:szCs w:val="28"/>
+                                <w:lang w:val="en-IN"/>
+                              </w:rPr>
+                            </w:pPr>
+                          </w:p>
+                        </w:txbxContent>
+                      </wps:txbx>
+                      <wps:bodyPr wrap="square" lIns="0" tIns="0" rIns="0" bIns="0" rtlCol="0">
+                        <a:noAutofit/>
+                      </wps:bodyPr>
+                    </wps:wsp>
+                  </a:graphicData>
+                </a:graphic>
+                <wp14:sizeRelH relativeFrom="margin">
+                  <wp14:pctWidth>0</wp14:pctWidth>
+                </wp14:sizeRelH>
+                <wp14:sizeRelV relativeFrom="margin">
+                  <wp14:pctHeight>0</wp14:pctHeight>
+                </wp14:sizeRelV>
+              </wp:anchor>
+            </w:drawing>
+          </mc:Choice>
+          <mc:Fallback>
+            <w:pict>
+              <v:shapetype w14:anchorId="5848C102" id="_x0000_t202" coordsize="21600,21600" o:spt="202" path="m,l,21600r21600,l21600,xe">
+                <v:stroke joinstyle="miter"/>
+                <v:path gradientshapeok="t" o:connecttype="rect"/>
+              </v:shapetype>
+              <v:shape id="Textbox 71" o:spid="_x0000_s1026" type="#_x0000_t202" style="position:absolute;margin-left:382pt;margin-top:213pt;width:179pt;height:26pt;z-index:251664384;visibility:visible;mso-wrap-style:square;mso-width-percent:0;mso-height-percent:0;mso-wrap-distance-left:9pt;mso-wrap-distance-top:0;mso-wrap-distance-right:9pt;mso-wrap-distance-bottom:0;mso-position-horizontal:absolute;mso-position-horizontal-relative:page;mso-position-vertical:absolute;mso-position-vertical-relative:page;mso-width-percent:0;mso-height-percent:0;mso-width-relative:margin;mso-height-relative:margin;v-text-anchor:top" o:gfxdata="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" o:allowincell="f" filled="f" stroked="f">
+                <v:textbox inset="0,0,0,0">
+                  <w:txbxContent>
+                    <w:p>
+                      <w:pPr>
+                        <w:ind w:left="761"/>
+                        <w:rPr>
+                          <w:sz w:val="29"/>
+                          <w:szCs w:val="18"/>
+                        </w:rPr>
+                      </w:pPr>
+                      <w:r>
+                        <w:rPr>
+                          <w:color w:val="030385"/>
+                          <w:spacing w:val="-2"/>
+                          <w:sz w:val="33"/>
+                        </w:rPr>
+                        <w:t xml:space="preserve">Date: </w:t>
+                      </w:r>
+                      <w:r>
+                        <w:rPr>
+                          <w:color w:val="030385"/>
+                          <w:spacing w:val="-2"/>
+                          <w:sz w:val="29"/>
+                          <w:szCs w:val="18"/>
+                        </w:rPr>
+                        <w:t>{{date}}</w:t>
+                      </w:r>
+                    </w:p>
+                    <w:p>
+                      <w:pPr>
+                        <w:spacing w:before="24" w:line="290" w:lineRule="auto"/>
+                        <w:ind w:right="680" w:firstLine="299"/>
+                        <w:rPr>
+                          <w:rFonts w:asciiTheme="minorHAnsi" w:hAnsiTheme="minorHAnsi" w:cstheme="minorHAnsi"/>
+                          <w:sz w:val="24"/>
+                          <w:szCs w:val="28"/>
+                          <w:lang w:val="en-IN"/>
+                        </w:rPr>
+                      </w:pPr>
+                    </w:p>
+                  </w:txbxContent>
+                </v:textbox>
+                <w10:wrap anchorx="page" anchory="page"/>
+              </v:shape>
+            </w:pict>
+          </mc:Fallback>
+        </mc:AlternateContent>
+      </w:r>
     </w:p>
     <w:p>
       <w:pPr>
@@ -4610,7 +4728,7 @@
     <w:p>
       <w:pPr>
         <w:spacing w:before="353" w:line="357" w:lineRule="auto"/>
-        <w:ind w:left="865" w:right="4706" w:hanging="23"/>
+        <w:ind w:left="865" w:right="-737" w:hanging="23"/>
         <w:rPr>
           <w:color w:val="1A1A1A"/>
           <w:sz w:val="33"/>
@@ -4625,7 +4743,7 @@
         <mc:AlternateContent>
           <mc:Choice Requires="wps">
             <w:drawing>
-              <wp:anchor distT="45720" distB="45720" distL="114300" distR="114300" simplePos="0" relativeHeight="251658244" behindDoc="0" locked="0" layoutInCell="1" allowOverlap="1" wp14:anchorId="03FE2591" wp14:editId="30D77D08">
+              <wp:anchor distT="45720" distB="45720" distL="114300" distR="114300" simplePos="0" relativeHeight="251655168" behindDoc="0" locked="0" layoutInCell="1" allowOverlap="1" wp14:anchorId="03FE2591" wp14:editId="30D77D08">
                 <wp:simplePos x="0" y="0"/>
                 <wp:positionH relativeFrom="column">
                   <wp:posOffset>4180840</wp:posOffset>
@@ -4699,11 +4817,7 @@
           </mc:Choice>
           <mc:Fallback>
             <w:pict>
-              <v:shapetype w14:anchorId="03FE2591" id="_x0000_t202" coordsize="21600,21600" o:spt="202" path="m,l,21600r21600,l21600,xe">
-                <v:stroke joinstyle="miter"/>
-                <v:path gradientshapeok="t" o:connecttype="rect"/>
-              </v:shapetype>
-              <v:shape id="Text Box 2" o:spid="_x0000_s1026" type="#_x0000_t202" style="position:absolute;left:0;text-align:left;margin-left:329.2pt;margin-top:17.65pt;width:185.9pt;height:25pt;z-index:251658244;visibility:visible;mso-wrap-style:square;mso-width-percent:400;mso-height-percent:0;mso-wrap-distance-left:9pt;mso-wrap-distance-top:3.6pt;mso-wrap-distance-right:9pt;mso-wrap-distance-bottom:3.6pt;mso-position-horizontal:absolute;mso-position-horizontal-relative:text;mso-position-vertical:absolute;mso-position-vertical-relative:text;mso-width-percent:400;mso-height-percent:0;mso-width-relative:margin;mso-height-relative:margin;v-text-anchor:top" o:gfxdata="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" filled="f" stroked="f">
+              <v:shape w14:anchorId="03FE2591" id="Text Box 2" o:spid="_x0000_s1027" type="#_x0000_t202" style="position:absolute;left:0;text-align:left;margin-left:329.2pt;margin-top:17.65pt;width:185.9pt;height:25pt;z-index:251655168;visibility:visible;mso-wrap-style:square;mso-width-percent:400;mso-height-percent:0;mso-wrap-distance-left:9pt;mso-wrap-distance-top:3.6pt;mso-wrap-distance-right:9pt;mso-wrap-distance-bottom:3.6pt;mso-position-horizontal:absolute;mso-position-horizontal-relative:text;mso-position-vertical:absolute;mso-position-vertical-relative:text;mso-width-percent:400;mso-height-percent:0;mso-width-relative:margin;mso-height-relative:margin;v-text-anchor:top" o:gfxdata="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" filled="f" stroked="f">
                 <v:textbox>
                   <w:txbxContent>
                     <w:p>
@@ -4758,8 +4872,17 @@
           <w:color w:val="1A1A1A"/>
           <w:sz w:val="33"/>
         </w:rPr>
-        <w:t xml:space="preserve">number}}   </w:t>
+        <w:t>number</w:t>
       </w:r>
+      <w:proofErr w:type="gramStart"/>
+      <w:r>
+        <w:rPr>
+          <w:color w:val="1A1A1A"/>
+          <w:sz w:val="33"/>
+        </w:rPr>
+        <w:t xml:space="preserve">}}   </w:t>
+      </w:r>
+      <w:proofErr w:type="gramEnd"/>
       <w:r>
         <w:rPr>
           <w:color w:val="1A1A1A"/>
@@ -4767,6 +4890,7 @@
         </w:rPr>
         <w:t xml:space="preserve"> </w:t>
       </w:r>
+      <w:proofErr w:type="gramStart"/>
       <w:r>
         <w:rPr>
           <w:color w:val="1A1A1A"/>
@@ -4774,6 +4898,23 @@
           <w:sz w:val="33"/>
         </w:rPr>
         <w:t>Address:</w:t>
+      </w:r>
+      <w:r>
+        <w:rPr>
+          <w:color w:val="1A1A1A"/>
+          <w:spacing w:val="-2"/>
+          <w:sz w:val="33"/>
+        </w:rPr>
+        <w:t>{</w:t>
+      </w:r>
+      <w:proofErr w:type="gramEnd"/>
+      <w:r>
+        <w:rPr>
+          <w:color w:val="1A1A1A"/>
+          <w:spacing w:val="-2"/>
+          <w:sz w:val="33"/>
+        </w:rPr>
+        <w:t>{add}}</w:t>
       </w:r>
     </w:p>
     <w:p>
@@ -4851,7 +4992,7 @@
         <mc:AlternateContent>
           <mc:Choice Requires="wps">
             <w:drawing>
-              <wp:anchor distT="0" distB="0" distL="114300" distR="114300" simplePos="0" relativeHeight="251658242" behindDoc="0" locked="0" layoutInCell="1" allowOverlap="1" wp14:anchorId="2A0130B2" wp14:editId="4DF33D9B">
+              <wp:anchor distT="0" distB="0" distL="114300" distR="114300" simplePos="0" relativeHeight="251653120" behindDoc="0" locked="0" layoutInCell="1" allowOverlap="1" wp14:anchorId="2A0130B2" wp14:editId="4DF33D9B">
                 <wp:simplePos x="0" y="0"/>
                 <wp:positionH relativeFrom="column">
                   <wp:posOffset>-266700</wp:posOffset>
@@ -4929,15 +5070,43 @@
                                 <w:sz w:val="32"/>
                                 <w:szCs w:val="32"/>
                               </w:rPr>
-                              <w:t>{{ht}}</w:t>
+                              <w:t>{{</w:t>
                             </w:r>
+                            <w:proofErr w:type="spellStart"/>
                             <w:r>
                               <w:rPr>
                                 <w:rFonts w:asciiTheme="minorHAnsi" w:hAnsiTheme="minorHAnsi" w:cstheme="minorHAnsi"/>
                                 <w:sz w:val="32"/>
                                 <w:szCs w:val="32"/>
                               </w:rPr>
-                              <w:t xml:space="preserve">             </w:t>
+                              <w:t>ht</w:t>
+                            </w:r>
+                            <w:proofErr w:type="spellEnd"/>
+                            <w:proofErr w:type="gramStart"/>
+                            <w:r>
+                              <w:rPr>
+                                <w:rFonts w:asciiTheme="minorHAnsi" w:hAnsiTheme="minorHAnsi" w:cstheme="minorHAnsi"/>
+                                <w:sz w:val="32"/>
+                                <w:szCs w:val="32"/>
+                              </w:rPr>
+                              <w:t>}}</w:t>
+                            </w:r>
+                            <w:r>
+                              <w:rPr>
+                                <w:rFonts w:asciiTheme="minorHAnsi" w:hAnsiTheme="minorHAnsi" w:cstheme="minorHAnsi"/>
+                                <w:sz w:val="32"/>
+                                <w:szCs w:val="32"/>
+                              </w:rPr>
+                              <w:t xml:space="preserve">   </w:t>
+                            </w:r>
+                            <w:proofErr w:type="gramEnd"/>
+                            <w:r>
+                              <w:rPr>
+                                <w:rFonts w:asciiTheme="minorHAnsi" w:hAnsiTheme="minorHAnsi" w:cstheme="minorHAnsi"/>
+                                <w:sz w:val="32"/>
+                                <w:szCs w:val="32"/>
+                              </w:rPr>
+                              <w:t xml:space="preserve">          </w:t>
                             </w:r>
                             <w:r>
                               <w:rPr>
@@ -4979,15 +5148,43 @@
                                 <w:sz w:val="32"/>
                                 <w:szCs w:val="32"/>
                               </w:rPr>
-                              <w:t>{{wt}}</w:t>
+                              <w:t>{{</w:t>
                             </w:r>
+                            <w:proofErr w:type="spellStart"/>
                             <w:r>
                               <w:rPr>
                                 <w:rFonts w:asciiTheme="minorHAnsi" w:hAnsiTheme="minorHAnsi" w:cstheme="minorHAnsi"/>
                                 <w:sz w:val="32"/>
                                 <w:szCs w:val="32"/>
                               </w:rPr>
-                              <w:t xml:space="preserve">                  </w:t>
+                              <w:t>wt</w:t>
+                            </w:r>
+                            <w:proofErr w:type="spellEnd"/>
+                            <w:proofErr w:type="gramStart"/>
+                            <w:r>
+                              <w:rPr>
+                                <w:rFonts w:asciiTheme="minorHAnsi" w:hAnsiTheme="minorHAnsi" w:cstheme="minorHAnsi"/>
+                                <w:sz w:val="32"/>
+                                <w:szCs w:val="32"/>
+                              </w:rPr>
+                              <w:t>}}</w:t>
+                            </w:r>
+                            <w:r>
+                              <w:rPr>
+                                <w:rFonts w:asciiTheme="minorHAnsi" w:hAnsiTheme="minorHAnsi" w:cstheme="minorHAnsi"/>
+                                <w:sz w:val="32"/>
+                                <w:szCs w:val="32"/>
+                              </w:rPr>
+                              <w:t xml:space="preserve">   </w:t>
+                            </w:r>
+                            <w:proofErr w:type="gramEnd"/>
+                            <w:r>
+                              <w:rPr>
+                                <w:rFonts w:asciiTheme="minorHAnsi" w:hAnsiTheme="minorHAnsi" w:cstheme="minorHAnsi"/>
+                                <w:sz w:val="32"/>
+                                <w:szCs w:val="32"/>
+                              </w:rPr>
+                              <w:t xml:space="preserve">               </w:t>
                             </w:r>
                             <w:r>
                               <w:rPr>
@@ -5058,15 +5255,43 @@
                                 <w:sz w:val="32"/>
                                 <w:szCs w:val="32"/>
                               </w:rPr>
-                              <w:t>{{pul}}</w:t>
+                              <w:t>{{</w:t>
                             </w:r>
+                            <w:proofErr w:type="spellStart"/>
                             <w:r>
                               <w:rPr>
                                 <w:rFonts w:asciiTheme="minorHAnsi" w:hAnsiTheme="minorHAnsi" w:cstheme="minorHAnsi"/>
                                 <w:sz w:val="32"/>
                                 <w:szCs w:val="32"/>
                               </w:rPr>
-                              <w:t xml:space="preserve">         </w:t>
+                              <w:t>pul</w:t>
+                            </w:r>
+                            <w:proofErr w:type="spellEnd"/>
+                            <w:proofErr w:type="gramStart"/>
+                            <w:r>
+                              <w:rPr>
+                                <w:rFonts w:asciiTheme="minorHAnsi" w:hAnsiTheme="minorHAnsi" w:cstheme="minorHAnsi"/>
+                                <w:sz w:val="32"/>
+                                <w:szCs w:val="32"/>
+                              </w:rPr>
+                              <w:t>}}</w:t>
+                            </w:r>
+                            <w:r>
+                              <w:rPr>
+                                <w:rFonts w:asciiTheme="minorHAnsi" w:hAnsiTheme="minorHAnsi" w:cstheme="minorHAnsi"/>
+                                <w:sz w:val="32"/>
+                                <w:szCs w:val="32"/>
+                              </w:rPr>
+                              <w:t xml:space="preserve">   </w:t>
+                            </w:r>
+                            <w:proofErr w:type="gramEnd"/>
+                            <w:r>
+                              <w:rPr>
+                                <w:rFonts w:asciiTheme="minorHAnsi" w:hAnsiTheme="minorHAnsi" w:cstheme="minorHAnsi"/>
+                                <w:sz w:val="32"/>
+                                <w:szCs w:val="32"/>
+                              </w:rPr>
+                              <w:t xml:space="preserve">      </w:t>
                             </w:r>
                             <w:r>
                               <w:rPr>
@@ -5112,6 +5337,7 @@
                               </w:rPr>
                               <w:t>bp</w:t>
                             </w:r>
+                            <w:proofErr w:type="gramStart"/>
                             <w:r>
                               <w:rPr>
                                 <w:rFonts w:asciiTheme="minorHAnsi" w:hAnsiTheme="minorHAnsi" w:cstheme="minorHAnsi"/>
@@ -5126,7 +5352,16 @@
                                 <w:sz w:val="32"/>
                                 <w:szCs w:val="32"/>
                               </w:rPr>
-                              <w:t xml:space="preserve">                         </w:t>
+                              <w:t xml:space="preserve">   </w:t>
+                            </w:r>
+                            <w:proofErr w:type="gramEnd"/>
+                            <w:r>
+                              <w:rPr>
+                                <w:rFonts w:asciiTheme="minorHAnsi" w:hAnsiTheme="minorHAnsi" w:cstheme="minorHAnsi"/>
+                                <w:sz w:val="32"/>
+                                <w:szCs w:val="32"/>
+                              </w:rPr>
+                              <w:t xml:space="preserve">                      </w:t>
                             </w:r>
                             <w:r>
                               <w:rPr>
@@ -5154,6 +5389,7 @@
                               </w:rPr>
                               <w:t>{{</w:t>
                             </w:r>
+                            <w:proofErr w:type="spellStart"/>
                             <w:r>
                               <w:rPr>
                                 <w:rFonts w:asciiTheme="minorHAnsi" w:hAnsiTheme="minorHAnsi" w:cstheme="minorHAnsi"/>
@@ -5162,6 +5398,7 @@
                               </w:rPr>
                               <w:t>rr</w:t>
                             </w:r>
+                            <w:proofErr w:type="spellEnd"/>
                             <w:r>
                               <w:rPr>
                                 <w:rFonts w:asciiTheme="minorHAnsi" w:hAnsiTheme="minorHAnsi" w:cstheme="minorHAnsi"/>
@@ -5212,15 +5449,33 @@
                                 <w:sz w:val="32"/>
                                 <w:szCs w:val="32"/>
                               </w:rPr>
-                              <w:t>{{temp}}</w:t>
+                              <w:t>{{temp</w:t>
                             </w:r>
+                            <w:proofErr w:type="gramStart"/>
                             <w:r>
                               <w:rPr>
                                 <w:rFonts w:asciiTheme="minorHAnsi" w:hAnsiTheme="minorHAnsi" w:cstheme="minorHAnsi"/>
                                 <w:sz w:val="32"/>
                                 <w:szCs w:val="32"/>
                               </w:rPr>
-                              <w:t xml:space="preserve">          </w:t>
+                              <w:t>}}</w:t>
+                            </w:r>
+                            <w:r>
+                              <w:rPr>
+                                <w:rFonts w:asciiTheme="minorHAnsi" w:hAnsiTheme="minorHAnsi" w:cstheme="minorHAnsi"/>
+                                <w:sz w:val="32"/>
+                                <w:szCs w:val="32"/>
+                              </w:rPr>
+                              <w:t xml:space="preserve">   </w:t>
+                            </w:r>
+                            <w:proofErr w:type="gramEnd"/>
+                            <w:r>
+                              <w:rPr>
+                                <w:rFonts w:asciiTheme="minorHAnsi" w:hAnsiTheme="minorHAnsi" w:cstheme="minorHAnsi"/>
+                                <w:sz w:val="32"/>
+                                <w:szCs w:val="32"/>
+                              </w:rPr>
+                              <w:t xml:space="preserve">       </w:t>
                             </w:r>
                             <w:r>
                               <w:rPr>
@@ -5274,7 +5529,7 @@
           </mc:Choice>
           <mc:Fallback>
             <w:pict>
-              <v:shape w14:anchorId="2A0130B2" id="Textbox 71" o:spid="_x0000_s1027" type="#_x0000_t202" style="position:absolute;margin-left:-21pt;margin-top:10.3pt;width:573.05pt;height:95.15pt;z-index:251658242;visibility:visible;mso-wrap-style:square;mso-width-percent:0;mso-height-percent:0;mso-wrap-distance-left:9pt;mso-wrap-distance-top:0;mso-wrap-distance-right:9pt;mso-wrap-distance-bottom:0;mso-position-horizontal:absolute;mso-position-horizontal-relative:text;mso-position-vertical:absolute;mso-position-vertical-relative:text;mso-width-percent:0;mso-height-percent:0;mso-width-relative:margin;mso-height-relative:margin;v-text-anchor:top" o:gfxdata="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" filled="f" stroked="f">
+              <v:shape w14:anchorId="2A0130B2" id="_x0000_s1028" type="#_x0000_t202" style="position:absolute;margin-left:-21pt;margin-top:10.3pt;width:573.05pt;height:95.15pt;z-index:251653120;visibility:visible;mso-wrap-style:square;mso-width-percent:0;mso-height-percent:0;mso-wrap-distance-left:9pt;mso-wrap-distance-top:0;mso-wrap-distance-right:9pt;mso-wrap-distance-bottom:0;mso-position-horizontal:absolute;mso-position-horizontal-relative:text;mso-position-vertical:absolute;mso-position-vertical-relative:text;mso-width-percent:0;mso-height-percent:0;mso-width-relative:margin;mso-height-relative:margin;v-text-anchor:top" o:gfxdata="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" filled="f" stroked="f">
                 <v:textbox inset="0,0,0,0">
                   <w:txbxContent>
                     <w:p>
@@ -5321,15 +5576,43 @@
                           <w:sz w:val="32"/>
                           <w:szCs w:val="32"/>
                         </w:rPr>
-                        <w:t>{{ht}}</w:t>
+                        <w:t>{{</w:t>
                       </w:r>
+                      <w:proofErr w:type="spellStart"/>
                       <w:r>
                         <w:rPr>
                           <w:rFonts w:asciiTheme="minorHAnsi" w:hAnsiTheme="minorHAnsi" w:cstheme="minorHAnsi"/>
                           <w:sz w:val="32"/>
                           <w:szCs w:val="32"/>
                         </w:rPr>
-                        <w:t xml:space="preserve">             </w:t>
+                        <w:t>ht</w:t>
+                      </w:r>
+                      <w:proofErr w:type="spellEnd"/>
+                      <w:proofErr w:type="gramStart"/>
+                      <w:r>
+                        <w:rPr>
+                          <w:rFonts w:asciiTheme="minorHAnsi" w:hAnsiTheme="minorHAnsi" w:cstheme="minorHAnsi"/>
+                          <w:sz w:val="32"/>
+                          <w:szCs w:val="32"/>
+                        </w:rPr>
+                        <w:t>}}</w:t>
+                      </w:r>
+                      <w:r>
+                        <w:rPr>
+                          <w:rFonts w:asciiTheme="minorHAnsi" w:hAnsiTheme="minorHAnsi" w:cstheme="minorHAnsi"/>
+                          <w:sz w:val="32"/>
+                          <w:szCs w:val="32"/>
+                        </w:rPr>
+                        <w:t xml:space="preserve">   </w:t>
+                      </w:r>
+                      <w:proofErr w:type="gramEnd"/>
+                      <w:r>
+                        <w:rPr>
+                          <w:rFonts w:asciiTheme="minorHAnsi" w:hAnsiTheme="minorHAnsi" w:cstheme="minorHAnsi"/>
+                          <w:sz w:val="32"/>
+                          <w:szCs w:val="32"/>
+                        </w:rPr>
+                        <w:t xml:space="preserve">          </w:t>
                       </w:r>
                       <w:r>
                         <w:rPr>
@@ -5371,15 +5654,43 @@
                           <w:sz w:val="32"/>
                           <w:szCs w:val="32"/>
                         </w:rPr>
-                        <w:t>{{wt}}</w:t>
+                        <w:t>{{</w:t>
                       </w:r>
+                      <w:proofErr w:type="spellStart"/>
                       <w:r>
                         <w:rPr>
                           <w:rFonts w:asciiTheme="minorHAnsi" w:hAnsiTheme="minorHAnsi" w:cstheme="minorHAnsi"/>
                           <w:sz w:val="32"/>
                           <w:szCs w:val="32"/>
                         </w:rPr>
-                        <w:t xml:space="preserve">                  </w:t>
+                        <w:t>wt</w:t>
+                      </w:r>
+                      <w:proofErr w:type="spellEnd"/>
+                      <w:proofErr w:type="gramStart"/>
+                      <w:r>
+                        <w:rPr>
+                          <w:rFonts w:asciiTheme="minorHAnsi" w:hAnsiTheme="minorHAnsi" w:cstheme="minorHAnsi"/>
+                          <w:sz w:val="32"/>
+                          <w:szCs w:val="32"/>
+                        </w:rPr>
+                        <w:t>}}</w:t>
+                      </w:r>
+                      <w:r>
+                        <w:rPr>
+                          <w:rFonts w:asciiTheme="minorHAnsi" w:hAnsiTheme="minorHAnsi" w:cstheme="minorHAnsi"/>
+                          <w:sz w:val="32"/>
+                          <w:szCs w:val="32"/>
+                        </w:rPr>
+                        <w:t xml:space="preserve">   </w:t>
+                      </w:r>
+                      <w:proofErr w:type="gramEnd"/>
+                      <w:r>
+                        <w:rPr>
+                          <w:rFonts w:asciiTheme="minorHAnsi" w:hAnsiTheme="minorHAnsi" w:cstheme="minorHAnsi"/>
+                          <w:sz w:val="32"/>
+                          <w:szCs w:val="32"/>
+                        </w:rPr>
+                        <w:t xml:space="preserve">               </w:t>
                       </w:r>
                       <w:r>
                         <w:rPr>
@@ -5450,15 +5761,43 @@
                           <w:sz w:val="32"/>
                           <w:szCs w:val="32"/>
                         </w:rPr>
-                        <w:t>{{pul}}</w:t>
+                        <w:t>{{</w:t>
                       </w:r>
+                      <w:proofErr w:type="spellStart"/>
                       <w:r>
                         <w:rPr>
                           <w:rFonts w:asciiTheme="minorHAnsi" w:hAnsiTheme="minorHAnsi" w:cstheme="minorHAnsi"/>
                           <w:sz w:val="32"/>
                           <w:szCs w:val="32"/>
                         </w:rPr>
-                        <w:t xml:space="preserve">         </w:t>
+                        <w:t>pul</w:t>
+                      </w:r>
+                      <w:proofErr w:type="spellEnd"/>
+                      <w:proofErr w:type="gramStart"/>
+                      <w:r>
+                        <w:rPr>
+                          <w:rFonts w:asciiTheme="minorHAnsi" w:hAnsiTheme="minorHAnsi" w:cstheme="minorHAnsi"/>
+                          <w:sz w:val="32"/>
+                          <w:szCs w:val="32"/>
+                        </w:rPr>
+                        <w:t>}}</w:t>
+                      </w:r>
+                      <w:r>
+                        <w:rPr>
+                          <w:rFonts w:asciiTheme="minorHAnsi" w:hAnsiTheme="minorHAnsi" w:cstheme="minorHAnsi"/>
+                          <w:sz w:val="32"/>
+                          <w:szCs w:val="32"/>
+                        </w:rPr>
+                        <w:t xml:space="preserve">   </w:t>
+                      </w:r>
+                      <w:proofErr w:type="gramEnd"/>
+                      <w:r>
+                        <w:rPr>
+                          <w:rFonts w:asciiTheme="minorHAnsi" w:hAnsiTheme="minorHAnsi" w:cstheme="minorHAnsi"/>
+                          <w:sz w:val="32"/>
+                          <w:szCs w:val="32"/>
+                        </w:rPr>
+                        <w:t xml:space="preserve">      </w:t>
                       </w:r>
                       <w:r>
                         <w:rPr>
@@ -5504,6 +5843,7 @@
                         </w:rPr>
                         <w:t>bp</w:t>
                       </w:r>
+                      <w:proofErr w:type="gramStart"/>
                       <w:r>
                         <w:rPr>
                           <w:rFonts w:asciiTheme="minorHAnsi" w:hAnsiTheme="minorHAnsi" w:cstheme="minorHAnsi"/>
@@ -5518,7 +5858,16 @@
                           <w:sz w:val="32"/>
                           <w:szCs w:val="32"/>
                         </w:rPr>
-                        <w:t xml:space="preserve">                         </w:t>
+                        <w:t xml:space="preserve">   </w:t>
+                      </w:r>
+                      <w:proofErr w:type="gramEnd"/>
+                      <w:r>
+                        <w:rPr>
+                          <w:rFonts w:asciiTheme="minorHAnsi" w:hAnsiTheme="minorHAnsi" w:cstheme="minorHAnsi"/>
+                          <w:sz w:val="32"/>
+                          <w:szCs w:val="32"/>
+                        </w:rPr>
+                        <w:t xml:space="preserve">                      </w:t>
                       </w:r>
                       <w:r>
                         <w:rPr>
@@ -5546,6 +5895,7 @@
                         </w:rPr>
                         <w:t>{{</w:t>
                       </w:r>
+                      <w:proofErr w:type="spellStart"/>
                       <w:r>
                         <w:rPr>
                           <w:rFonts w:asciiTheme="minorHAnsi" w:hAnsiTheme="minorHAnsi" w:cstheme="minorHAnsi"/>
@@ -5554,6 +5904,7 @@
                         </w:rPr>
                         <w:t>rr</w:t>
                       </w:r>
+                      <w:proofErr w:type="spellEnd"/>
                       <w:r>
                         <w:rPr>
                           <w:rFonts w:asciiTheme="minorHAnsi" w:hAnsiTheme="minorHAnsi" w:cstheme="minorHAnsi"/>
@@ -5604,15 +5955,33 @@
                           <w:sz w:val="32"/>
                           <w:szCs w:val="32"/>
                         </w:rPr>
-                        <w:t>{{temp}}</w:t>
+                        <w:t>{{temp</w:t>
                       </w:r>
+                      <w:proofErr w:type="gramStart"/>
                       <w:r>
                         <w:rPr>
                           <w:rFonts w:asciiTheme="minorHAnsi" w:hAnsiTheme="minorHAnsi" w:cstheme="minorHAnsi"/>
                           <w:sz w:val="32"/>
                           <w:szCs w:val="32"/>
                         </w:rPr>
-                        <w:t xml:space="preserve">          </w:t>
+                        <w:t>}}</w:t>
+                      </w:r>
+                      <w:r>
+                        <w:rPr>
+                          <w:rFonts w:asciiTheme="minorHAnsi" w:hAnsiTheme="minorHAnsi" w:cstheme="minorHAnsi"/>
+                          <w:sz w:val="32"/>
+                          <w:szCs w:val="32"/>
+                        </w:rPr>
+                        <w:t xml:space="preserve">   </w:t>
+                      </w:r>
+                      <w:proofErr w:type="gramEnd"/>
+                      <w:r>
+                        <w:rPr>
+                          <w:rFonts w:asciiTheme="minorHAnsi" w:hAnsiTheme="minorHAnsi" w:cstheme="minorHAnsi"/>
+                          <w:sz w:val="32"/>
+                          <w:szCs w:val="32"/>
+                        </w:rPr>
+                        <w:t xml:space="preserve">       </w:t>
                       </w:r>
                       <w:r>
                         <w:rPr>
@@ -5776,7 +6145,7 @@
         <mc:AlternateContent>
           <mc:Choice Requires="wps">
             <w:drawing>
-              <wp:anchor distT="0" distB="0" distL="114300" distR="114300" simplePos="0" relativeHeight="251658243" behindDoc="0" locked="0" layoutInCell="1" allowOverlap="1" wp14:anchorId="27167169" wp14:editId="70A6103D">
+              <wp:anchor distT="0" distB="0" distL="114300" distR="114300" simplePos="0" relativeHeight="251654144" behindDoc="0" locked="0" layoutInCell="1" allowOverlap="1" wp14:anchorId="27167169" wp14:editId="70A6103D">
                 <wp:simplePos x="0" y="0"/>
                 <wp:positionH relativeFrom="column">
                   <wp:posOffset>185057</wp:posOffset>
@@ -5850,7 +6219,7 @@
           </mc:Choice>
           <mc:Fallback>
             <w:pict>
-              <v:shape w14:anchorId="27167169" id="_x0000_s1028" type="#_x0000_t202" style="position:absolute;margin-left:14.55pt;margin-top:5.95pt;width:509.2pt;height:68.25pt;z-index:251658243;visibility:visible;mso-wrap-style:square;mso-width-percent:0;mso-height-percent:0;mso-wrap-distance-left:9pt;mso-wrap-distance-top:0;mso-wrap-distance-right:9pt;mso-wrap-distance-bottom:0;mso-position-horizontal:absolute;mso-position-horizontal-relative:text;mso-position-vertical:absolute;mso-position-vertical-relative:text;mso-width-percent:0;mso-height-percent:0;mso-width-relative:margin;mso-height-relative:margin;v-text-anchor:top" o:gfxdata="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" filled="f" stroked="f">
+              <v:shape w14:anchorId="27167169" id="_x0000_s1029" type="#_x0000_t202" style="position:absolute;margin-left:14.55pt;margin-top:5.95pt;width:509.2pt;height:68.25pt;z-index:251654144;visibility:visible;mso-wrap-style:square;mso-width-percent:0;mso-height-percent:0;mso-wrap-distance-left:9pt;mso-wrap-distance-top:0;mso-wrap-distance-right:9pt;mso-wrap-distance-bottom:0;mso-position-horizontal:absolute;mso-position-horizontal-relative:text;mso-position-vertical:absolute;mso-position-vertical-relative:text;mso-width-percent:0;mso-height-percent:0;mso-width-relative:margin;mso-height-relative:margin;v-text-anchor:top" o:gfxdata="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" filled="f" stroked="f">
                 <v:textbox inset="0,0,0,0">
                   <w:txbxContent>
                     <w:p>
@@ -5925,7 +6294,7 @@
         <mc:AlternateContent>
           <mc:Choice Requires="wps">
             <w:drawing>
-              <wp:anchor distT="0" distB="0" distL="114300" distR="114300" simplePos="0" relativeHeight="251658246" behindDoc="0" locked="0" layoutInCell="1" allowOverlap="1" wp14:anchorId="4D72B3FA" wp14:editId="4B2C2B1F">
+              <wp:anchor distT="0" distB="0" distL="114300" distR="114300" simplePos="0" relativeHeight="251659264" behindDoc="0" locked="0" layoutInCell="1" allowOverlap="1" wp14:anchorId="4D72B3FA" wp14:editId="4B2C2B1F">
                 <wp:simplePos x="0" y="0"/>
                 <wp:positionH relativeFrom="column">
                   <wp:posOffset>4500649</wp:posOffset>
@@ -6099,7 +6468,7 @@
           </mc:Choice>
           <mc:Fallback>
             <w:pict>
-              <v:shape w14:anchorId="4D72B3FA" id="_x0000_s1029" type="#_x0000_t202" style="position:absolute;margin-left:354.4pt;margin-top:13.05pt;width:187.05pt;height:44.05pt;z-index:251658246;visibility:visible;mso-wrap-style:square;mso-width-percent:0;mso-height-percent:0;mso-wrap-distance-left:9pt;mso-wrap-distance-top:0;mso-wrap-distance-right:9pt;mso-wrap-distance-bottom:0;mso-position-horizontal:absolute;mso-position-horizontal-relative:text;mso-position-vertical:absolute;mso-position-vertical-relative:text;mso-width-percent:0;mso-height-percent:0;mso-width-relative:margin;mso-height-relative:margin;v-text-anchor:top" o:gfxdata="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" filled="f" stroked="f">
+              <v:shape w14:anchorId="4D72B3FA" id="_x0000_s1030" type="#_x0000_t202" style="position:absolute;margin-left:354.4pt;margin-top:13.05pt;width:187.05pt;height:44.05pt;z-index:251659264;visibility:visible;mso-wrap-style:square;mso-width-percent:0;mso-height-percent:0;mso-wrap-distance-left:9pt;mso-wrap-distance-top:0;mso-wrap-distance-right:9pt;mso-wrap-distance-bottom:0;mso-position-horizontal:absolute;mso-position-horizontal-relative:text;mso-position-vertical:absolute;mso-position-vertical-relative:text;mso-width-percent:0;mso-height-percent:0;mso-width-relative:margin;mso-height-relative:margin;v-text-anchor:top" o:gfxdata="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" filled="f" stroked="f">
                 <v:textbox inset="0,0,0,0">
                   <w:txbxContent>
                     <w:p>
@@ -6284,7 +6653,7 @@
         <mc:AlternateContent>
           <mc:Choice Requires="wps">
             <w:drawing>
-              <wp:anchor distT="0" distB="0" distL="114300" distR="114300" simplePos="0" relativeHeight="251658245" behindDoc="0" locked="0" layoutInCell="1" allowOverlap="1" wp14:anchorId="7E923D34" wp14:editId="0224223F">
+              <wp:anchor distT="0" distB="0" distL="114300" distR="114300" simplePos="0" relativeHeight="251657216" behindDoc="0" locked="0" layoutInCell="1" allowOverlap="1" wp14:anchorId="7E923D34" wp14:editId="0224223F">
                 <wp:simplePos x="0" y="0"/>
                 <wp:positionH relativeFrom="column">
                   <wp:posOffset>-1270</wp:posOffset>
@@ -6336,6 +6705,7 @@
                               </w:rPr>
                               <w:t xml:space="preserve">#Near Railway Station, </w:t>
                             </w:r>
+                            <w:proofErr w:type="spellStart"/>
                             <w:r>
                               <w:rPr>
                                 <w:rFonts w:ascii="Tahoma"/>
@@ -6344,7 +6714,18 @@
                                 <w:w w:val="105"/>
                                 <w:sz w:val="29"/>
                               </w:rPr>
-                              <w:t xml:space="preserve">Rajendranagar, </w:t>
+                              <w:t>Rajendranagar</w:t>
+                            </w:r>
+                            <w:proofErr w:type="spellEnd"/>
+                            <w:r>
+                              <w:rPr>
+                                <w:rFonts w:ascii="Tahoma"/>
+                                <w:color w:val="313130"/>
+                                <w:spacing w:val="-2"/>
+                                <w:w w:val="105"/>
+                                <w:sz w:val="29"/>
+                              </w:rPr>
+                              <w:t xml:space="preserve">, </w:t>
                             </w:r>
                             <w:r>
                               <w:rPr>
@@ -6425,7 +6806,7 @@
           </mc:Choice>
           <mc:Fallback>
             <w:pict>
-              <v:shape w14:anchorId="7E923D34" id="_x0000_s1030" type="#_x0000_t202" style="position:absolute;left:0;text-align:left;margin-left:-.1pt;margin-top:.4pt;width:213pt;height:68.25pt;z-index:251658245;visibility:visible;mso-wrap-style:square;mso-width-percent:0;mso-height-percent:0;mso-wrap-distance-left:9pt;mso-wrap-distance-top:0;mso-wrap-distance-right:9pt;mso-wrap-distance-bottom:0;mso-position-horizontal:absolute;mso-position-horizontal-relative:text;mso-position-vertical:absolute;mso-position-vertical-relative:text;mso-width-percent:0;mso-height-percent:0;mso-width-relative:margin;mso-height-relative:margin;v-text-anchor:top" o:gfxdata="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" filled="f" stroked="f">
+              <v:shape w14:anchorId="7E923D34" id="_x0000_s1031" type="#_x0000_t202" style="position:absolute;left:0;text-align:left;margin-left:-.1pt;margin-top:.4pt;width:213pt;height:68.25pt;z-index:251657216;visibility:visible;mso-wrap-style:square;mso-width-percent:0;mso-height-percent:0;mso-wrap-distance-left:9pt;mso-wrap-distance-top:0;mso-wrap-distance-right:9pt;mso-wrap-distance-bottom:0;mso-position-horizontal:absolute;mso-position-horizontal-relative:text;mso-position-vertical:absolute;mso-position-vertical-relative:text;mso-width-percent:0;mso-height-percent:0;mso-width-relative:margin;mso-height-relative:margin;v-text-anchor:top" o:gfxdata="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" filled="f" stroked="f">
                 <v:textbox inset="0,0,0,0">
                   <w:txbxContent>
                     <w:p>
@@ -6446,6 +6827,7 @@
                         </w:rPr>
                         <w:t xml:space="preserve">#Near Railway Station, </w:t>
                       </w:r>
+                      <w:proofErr w:type="spellStart"/>
                       <w:r>
                         <w:rPr>
                           <w:rFonts w:ascii="Tahoma"/>
@@ -6454,7 +6836,18 @@
                           <w:w w:val="105"/>
                           <w:sz w:val="29"/>
                         </w:rPr>
-                        <w:t xml:space="preserve">Rajendranagar, </w:t>
+                        <w:t>Rajendranagar</w:t>
+                      </w:r>
+                      <w:proofErr w:type="spellEnd"/>
+                      <w:r>
+                        <w:rPr>
+                          <w:rFonts w:ascii="Tahoma"/>
+                          <w:color w:val="313130"/>
+                          <w:spacing w:val="-2"/>
+                          <w:w w:val="105"/>
+                          <w:sz w:val="29"/>
+                        </w:rPr>
+                        <w:t xml:space="preserve">, </w:t>
                       </w:r>
                       <w:r>
                         <w:rPr>
@@ -6572,7 +6965,7 @@
         <mc:AlternateContent>
           <mc:Choice Requires="wps">
             <w:drawing>
-              <wp:anchor distT="0" distB="0" distL="114300" distR="114300" simplePos="0" relativeHeight="251654144" behindDoc="0" locked="1" layoutInCell="1" allowOverlap="1" wp14:anchorId="1C567851" wp14:editId="303AF631">
+              <wp:anchor distT="0" distB="0" distL="114300" distR="114300" simplePos="0" relativeHeight="251652096" behindDoc="0" locked="1" layoutInCell="0" allowOverlap="1" wp14:anchorId="1C567851" wp14:editId="73FA9905">
                 <wp:simplePos x="0" y="0"/>
                 <wp:positionH relativeFrom="page">
                   <wp:posOffset>3201035</wp:posOffset>
@@ -6673,7 +7066,7 @@
           </mc:Choice>
           <mc:Fallback>
             <w:pict>
-              <v:shape w14:anchorId="1C567851" id="_x0000_s1031" type="#_x0000_t202" style="position:absolute;margin-left:252.05pt;margin-top:732.55pt;width:117.35pt;height:28.35pt;z-index:251654144;visibility:visible;mso-wrap-style:square;mso-width-percent:0;mso-height-percent:0;mso-wrap-distance-left:9pt;mso-wrap-distance-top:0;mso-wrap-distance-right:9pt;mso-wrap-distance-bottom:0;mso-position-horizontal:absolute;mso-position-horizontal-relative:page;mso-position-vertical:absolute;mso-position-vertical-relative:page;mso-width-percent:0;mso-height-percent:0;mso-width-relative:margin;mso-height-relative:margin;v-text-anchor:top" o:gfxdata="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" filled="f" stroked="f">
+              <v:shape w14:anchorId="1C567851" id="_x0000_s1032" type="#_x0000_t202" style="position:absolute;margin-left:252.05pt;margin-top:732.55pt;width:117.35pt;height:28.35pt;z-index:251652096;visibility:visible;mso-wrap-style:square;mso-width-percent:0;mso-height-percent:0;mso-wrap-distance-left:9pt;mso-wrap-distance-top:0;mso-wrap-distance-right:9pt;mso-wrap-distance-bottom:0;mso-position-horizontal:absolute;mso-position-horizontal-relative:page;mso-position-vertical:absolute;mso-position-vertical-relative:page;mso-width-percent:0;mso-height-percent:0;mso-width-relative:margin;mso-height-relative:margin;v-text-anchor:top" o:gfxdata="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" o:allowincell="f" filled="f" stroked="f">
                 <v:textbox inset="0,0,0,0">
                   <w:txbxContent>
                     <w:p>
@@ -6782,7 +7175,7 @@
         <mc:AlternateContent>
           <mc:Choice Requires="wps">
             <w:drawing>
-              <wp:anchor distT="0" distB="0" distL="114300" distR="114300" simplePos="0" relativeHeight="251658240" behindDoc="0" locked="1" layoutInCell="1" allowOverlap="1" wp14:anchorId="1EDC94A4" wp14:editId="3E6E999D">
+              <wp:anchor distT="0" distB="0" distL="114300" distR="114300" simplePos="0" relativeHeight="251658240" behindDoc="0" locked="1" layoutInCell="0" allowOverlap="1" wp14:anchorId="1EDC94A4" wp14:editId="0AA1E937">
                 <wp:simplePos x="0" y="0"/>
                 <wp:positionH relativeFrom="page">
                   <wp:posOffset>3294380</wp:posOffset>
@@ -6856,7 +7249,7 @@
           </mc:Choice>
           <mc:Fallback>
             <w:pict>
-              <v:shape w14:anchorId="1EDC94A4" id="_x0000_s1032" type="#_x0000_t202" style="position:absolute;left:0;text-align:left;margin-left:259.4pt;margin-top:769.7pt;width:138.05pt;height:15.85pt;z-index:251658240;visibility:visible;mso-wrap-style:square;mso-width-percent:0;mso-height-percent:0;mso-wrap-distance-left:9pt;mso-wrap-distance-top:0;mso-wrap-distance-right:9pt;mso-wrap-distance-bottom:0;mso-position-horizontal:absolute;mso-position-horizontal-relative:page;mso-position-vertical:absolute;mso-position-vertical-relative:page;mso-width-percent:0;mso-height-percent:0;mso-width-relative:margin;mso-height-relative:margin;v-text-anchor:top" o:gfxdata="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" filled="f" stroked="f">
+              <v:shape w14:anchorId="1EDC94A4" id="_x0000_s1033" type="#_x0000_t202" style="position:absolute;left:0;text-align:left;margin-left:259.4pt;margin-top:769.7pt;width:138.05pt;height:15.85pt;z-index:251658240;visibility:visible;mso-wrap-style:square;mso-width-percent:0;mso-height-percent:0;mso-wrap-distance-left:9pt;mso-wrap-distance-top:0;mso-wrap-distance-right:9pt;mso-wrap-distance-bottom:0;mso-position-horizontal:absolute;mso-position-horizontal-relative:page;mso-position-vertical:absolute;mso-position-vertical-relative:page;mso-width-percent:0;mso-height-percent:0;mso-width-relative:margin;mso-height-relative:margin;v-text-anchor:top" o:gfxdata="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" o:allowincell="f" filled="f" stroked="f">
                 <v:textbox inset="0,0,0,0">
                   <w:txbxContent>
                     <w:p>

</xml_diff>

<commit_message>
Use BMI value in report placeholder
</commit_message>
<xml_diff>
--- a/template.docx
+++ b/template.docx
@@ -20,13 +20,13 @@
         <mc:AlternateContent>
           <mc:Choice Requires="wpg">
             <w:drawing>
-              <wp:anchor distT="0" distB="0" distL="0" distR="0" simplePos="0" relativeHeight="251658248" behindDoc="1" locked="0" layoutInCell="1" allowOverlap="1" wp14:anchorId="050C84EA" wp14:editId="7D81FF83">
+              <wp:anchor distT="0" distB="0" distL="0" distR="0" simplePos="0" relativeHeight="251574784" behindDoc="1" locked="0" layoutInCell="1" allowOverlap="1" wp14:anchorId="050C84EA" wp14:editId="4460DBFD">
                 <wp:simplePos x="0" y="0"/>
                 <wp:positionH relativeFrom="page">
                   <wp:posOffset>0</wp:posOffset>
                 </wp:positionH>
                 <wp:positionV relativeFrom="page">
-                  <wp:posOffset>0</wp:posOffset>
+                  <wp:posOffset>19050</wp:posOffset>
                 </wp:positionV>
                 <wp:extent cx="7557770" cy="10691495"/>
                 <wp:effectExtent l="0" t="0" r="5080" b="0"/>
@@ -3126,8 +3126,8 @@
                         <wps:cNvSpPr/>
                         <wps:spPr>
                           <a:xfrm>
-                            <a:off x="444621" y="3078587"/>
-                            <a:ext cx="6667500" cy="2132330"/>
+                            <a:off x="234954" y="3107799"/>
+                            <a:ext cx="7061333" cy="2132330"/>
                           </a:xfrm>
                           <a:custGeom>
                             <a:avLst/>
@@ -3268,163 +3268,98 @@
                             <a:srgbClr val="ECECEC"/>
                           </a:solidFill>
                         </wps:spPr>
-                        <wps:bodyPr wrap="square" lIns="0" tIns="0" rIns="0" bIns="0" rtlCol="0">
-                          <a:prstTxWarp prst="textNoShape">
-                            <a:avLst/>
-                          </a:prstTxWarp>
-                          <a:noAutofit/>
-                        </wps:bodyPr>
-                      </wps:wsp>
-                      <wps:wsp>
-                        <wps:cNvPr id="17" name="Graphic 17"/>
-                        <wps:cNvSpPr/>
-                        <wps:spPr>
-                          <a:xfrm>
-                            <a:off x="444621" y="3078587"/>
-                            <a:ext cx="6667500" cy="2132330"/>
-                          </a:xfrm>
-                          <a:custGeom>
-                            <a:avLst/>
-                            <a:gdLst/>
-                            <a:ahLst/>
-                            <a:cxnLst/>
-                            <a:rect l="l" t="t" r="r" b="b"/>
-                            <a:pathLst>
-                              <a:path w="6667500" h="2132330">
-                                <a:moveTo>
-                                  <a:pt x="249378" y="0"/>
-                                </a:moveTo>
-                                <a:lnTo>
-                                  <a:pt x="6418126" y="0"/>
-                                </a:lnTo>
-                                <a:lnTo>
-                                  <a:pt x="6462803" y="4036"/>
-                                </a:lnTo>
-                                <a:lnTo>
-                                  <a:pt x="6504913" y="15667"/>
-                                </a:lnTo>
-                                <a:lnTo>
-                                  <a:pt x="6543740" y="34173"/>
-                                </a:lnTo>
-                                <a:lnTo>
-                                  <a:pt x="6578564" y="58837"/>
-                                </a:lnTo>
-                                <a:lnTo>
-                                  <a:pt x="6608667" y="88940"/>
-                                </a:lnTo>
-                                <a:lnTo>
-                                  <a:pt x="6633331" y="123764"/>
-                                </a:lnTo>
-                                <a:lnTo>
-                                  <a:pt x="6651837" y="162591"/>
-                                </a:lnTo>
-                                <a:lnTo>
-                                  <a:pt x="6663468" y="204701"/>
-                                </a:lnTo>
-                                <a:lnTo>
-                                  <a:pt x="6667505" y="249378"/>
-                                </a:lnTo>
-                                <a:lnTo>
-                                  <a:pt x="6667505" y="1882443"/>
-                                </a:lnTo>
-                                <a:lnTo>
-                                  <a:pt x="6663468" y="1927120"/>
-                                </a:lnTo>
-                                <a:lnTo>
-                                  <a:pt x="6651837" y="1969230"/>
-                                </a:lnTo>
-                                <a:lnTo>
-                                  <a:pt x="6633331" y="2008057"/>
-                                </a:lnTo>
-                                <a:lnTo>
-                                  <a:pt x="6608667" y="2042881"/>
-                                </a:lnTo>
-                                <a:lnTo>
-                                  <a:pt x="6578564" y="2072984"/>
-                                </a:lnTo>
-                                <a:lnTo>
-                                  <a:pt x="6543740" y="2097648"/>
-                                </a:lnTo>
-                                <a:lnTo>
-                                  <a:pt x="6504913" y="2116154"/>
-                                </a:lnTo>
-                                <a:lnTo>
-                                  <a:pt x="6462803" y="2127785"/>
-                                </a:lnTo>
-                                <a:lnTo>
-                                  <a:pt x="6418126" y="2131821"/>
-                                </a:lnTo>
-                                <a:lnTo>
-                                  <a:pt x="249378" y="2131821"/>
-                                </a:lnTo>
-                                <a:lnTo>
-                                  <a:pt x="204701" y="2127785"/>
-                                </a:lnTo>
-                                <a:lnTo>
-                                  <a:pt x="162591" y="2116154"/>
-                                </a:lnTo>
-                                <a:lnTo>
-                                  <a:pt x="123764" y="2097648"/>
-                                </a:lnTo>
-                                <a:lnTo>
-                                  <a:pt x="88940" y="2072984"/>
-                                </a:lnTo>
-                                <a:lnTo>
-                                  <a:pt x="58837" y="2042881"/>
-                                </a:lnTo>
-                                <a:lnTo>
-                                  <a:pt x="34173" y="2008057"/>
-                                </a:lnTo>
-                                <a:lnTo>
-                                  <a:pt x="15667" y="1969230"/>
-                                </a:lnTo>
-                                <a:lnTo>
-                                  <a:pt x="4036" y="1927120"/>
-                                </a:lnTo>
-                                <a:lnTo>
-                                  <a:pt x="0" y="1882443"/>
-                                </a:lnTo>
-                                <a:lnTo>
-                                  <a:pt x="0" y="249378"/>
-                                </a:lnTo>
-                                <a:lnTo>
-                                  <a:pt x="4036" y="204701"/>
-                                </a:lnTo>
-                                <a:lnTo>
-                                  <a:pt x="15667" y="162591"/>
-                                </a:lnTo>
-                                <a:lnTo>
-                                  <a:pt x="34173" y="123764"/>
-                                </a:lnTo>
-                                <a:lnTo>
-                                  <a:pt x="58837" y="88940"/>
-                                </a:lnTo>
-                                <a:lnTo>
-                                  <a:pt x="88940" y="58837"/>
-                                </a:lnTo>
-                                <a:lnTo>
-                                  <a:pt x="123764" y="34173"/>
-                                </a:lnTo>
-                                <a:lnTo>
-                                  <a:pt x="162591" y="15667"/>
-                                </a:lnTo>
-                                <a:lnTo>
-                                  <a:pt x="204701" y="4036"/>
-                                </a:lnTo>
-                                <a:lnTo>
-                                  <a:pt x="249378" y="0"/>
-                                </a:lnTo>
-                                <a:close/>
-                              </a:path>
-                            </a:pathLst>
-                          </a:custGeom>
-                          <a:ln w="7199">
-                            <a:solidFill>
-                              <a:srgbClr val="030385"/>
-                            </a:solidFill>
-                            <a:prstDash val="solid"/>
-                          </a:ln>
-                        </wps:spPr>
+                        <wps:txbx>
+                          <w:txbxContent>
+                            <w:p>
+                              <w:pPr>
+                                <w:jc w:val="center"/>
+                                <w:rPr>
+                                  <w:lang w:val="en-IN"/>
+                                </w:rPr>
+                              </w:pPr>
+                            </w:p>
+                            <w:p>
+                              <w:pPr>
+                                <w:jc w:val="center"/>
+                                <w:rPr>
+                                  <w:lang w:val="en-IN"/>
+                                </w:rPr>
+                              </w:pPr>
+                            </w:p>
+                            <w:p>
+                              <w:pPr>
+                                <w:jc w:val="center"/>
+                                <w:rPr>
+                                  <w:lang w:val="en-IN"/>
+                                </w:rPr>
+                              </w:pPr>
+                            </w:p>
+                            <w:p>
+                              <w:pPr>
+                                <w:jc w:val="center"/>
+                                <w:rPr>
+                                  <w:lang w:val="en-IN"/>
+                                </w:rPr>
+                              </w:pPr>
+                            </w:p>
+                            <w:p>
+                              <w:pPr>
+                                <w:jc w:val="center"/>
+                                <w:rPr>
+                                  <w:lang w:val="en-IN"/>
+                                </w:rPr>
+                              </w:pPr>
+                            </w:p>
+                            <w:p>
+                              <w:pPr>
+                                <w:jc w:val="center"/>
+                                <w:rPr>
+                                  <w:lang w:val="en-IN"/>
+                                </w:rPr>
+                              </w:pPr>
+                            </w:p>
+                            <w:p>
+                              <w:pPr>
+                                <w:jc w:val="center"/>
+                                <w:rPr>
+                                  <w:lang w:val="en-IN"/>
+                                </w:rPr>
+                              </w:pPr>
+                            </w:p>
+                            <w:p>
+                              <w:pPr>
+                                <w:jc w:val="center"/>
+                                <w:rPr>
+                                  <w:lang w:val="en-IN"/>
+                                </w:rPr>
+                              </w:pPr>
+                            </w:p>
+                            <w:p>
+                              <w:pPr>
+                                <w:jc w:val="center"/>
+                                <w:rPr>
+                                  <w:lang w:val="en-IN"/>
+                                </w:rPr>
+                              </w:pPr>
+                            </w:p>
+                            <w:p>
+                              <w:pPr>
+                                <w:jc w:val="center"/>
+                                <w:rPr>
+                                  <w:lang w:val="en-IN"/>
+                                </w:rPr>
+                              </w:pPr>
+                            </w:p>
+                            <w:p>
+                              <w:pPr>
+                                <w:jc w:val="center"/>
+                                <w:rPr>
+                                  <w:lang w:val="en-IN"/>
+                                </w:rPr>
+                              </w:pPr>
+                            </w:p>
+                          </w:txbxContent>
+                        </wps:txbx>
                         <wps:bodyPr wrap="square" lIns="0" tIns="0" rIns="0" bIns="0" rtlCol="0">
                           <a:prstTxWarp prst="textNoShape">
                             <a:avLst/>
@@ -3434,95 +3369,11 @@
                       </wps:wsp>
                       <pic:pic xmlns:pic="http://schemas.openxmlformats.org/drawingml/2006/picture">
                         <pic:nvPicPr>
-                          <pic:cNvPr id="18" name="Image 18"/>
+                          <pic:cNvPr id="22" name="Image 22"/>
                           <pic:cNvPicPr/>
                         </pic:nvPicPr>
                         <pic:blipFill>
                           <a:blip r:embed="rId11" cstate="print"/>
-                          <a:stretch>
-                            <a:fillRect/>
-                          </a:stretch>
-                        </pic:blipFill>
-                        <pic:spPr>
-                          <a:xfrm>
-                            <a:off x="691123" y="3508507"/>
-                            <a:ext cx="117662" cy="117643"/>
-                          </a:xfrm>
-                          <a:prstGeom prst="rect">
-                            <a:avLst/>
-                          </a:prstGeom>
-                        </pic:spPr>
-                      </pic:pic>
-                      <pic:pic xmlns:pic="http://schemas.openxmlformats.org/drawingml/2006/picture">
-                        <pic:nvPicPr>
-                          <pic:cNvPr id="19" name="Image 19"/>
-                          <pic:cNvPicPr/>
-                        </pic:nvPicPr>
-                        <pic:blipFill>
-                          <a:blip r:embed="rId12" cstate="print"/>
-                          <a:stretch>
-                            <a:fillRect/>
-                          </a:stretch>
-                        </pic:blipFill>
-                        <pic:spPr>
-                          <a:xfrm>
-                            <a:off x="691429" y="4312991"/>
-                            <a:ext cx="117040" cy="117019"/>
-                          </a:xfrm>
-                          <a:prstGeom prst="rect">
-                            <a:avLst/>
-                          </a:prstGeom>
-                        </pic:spPr>
-                      </pic:pic>
-                      <pic:pic xmlns:pic="http://schemas.openxmlformats.org/drawingml/2006/picture">
-                        <pic:nvPicPr>
-                          <pic:cNvPr id="20" name="Image 20"/>
-                          <pic:cNvPicPr/>
-                        </pic:nvPicPr>
-                        <pic:blipFill>
-                          <a:blip r:embed="rId13" cstate="print"/>
-                          <a:stretch>
-                            <a:fillRect/>
-                          </a:stretch>
-                        </pic:blipFill>
-                        <pic:spPr>
-                          <a:xfrm>
-                            <a:off x="681195" y="3868686"/>
-                            <a:ext cx="138118" cy="125321"/>
-                          </a:xfrm>
-                          <a:prstGeom prst="rect">
-                            <a:avLst/>
-                          </a:prstGeom>
-                        </pic:spPr>
-                      </pic:pic>
-                      <pic:pic xmlns:pic="http://schemas.openxmlformats.org/drawingml/2006/picture">
-                        <pic:nvPicPr>
-                          <pic:cNvPr id="21" name="Image 21"/>
-                          <pic:cNvPicPr/>
-                        </pic:nvPicPr>
-                        <pic:blipFill>
-                          <a:blip r:embed="rId14" cstate="print"/>
-                          <a:stretch>
-                            <a:fillRect/>
-                          </a:stretch>
-                        </pic:blipFill>
-                        <pic:spPr>
-                          <a:xfrm>
-                            <a:off x="1676264" y="3867565"/>
-                            <a:ext cx="160871" cy="129843"/>
-                          </a:xfrm>
-                          <a:prstGeom prst="rect">
-                            <a:avLst/>
-                          </a:prstGeom>
-                        </pic:spPr>
-                      </pic:pic>
-                      <pic:pic xmlns:pic="http://schemas.openxmlformats.org/drawingml/2006/picture">
-                        <pic:nvPicPr>
-                          <pic:cNvPr id="22" name="Image 22"/>
-                          <pic:cNvPicPr/>
-                        </pic:nvPicPr>
-                        <pic:blipFill>
-                          <a:blip r:embed="rId15" cstate="print"/>
                           <a:stretch>
                             <a:fillRect/>
                           </a:stretch>
@@ -3543,7 +3394,7 @@
                           <pic:cNvPicPr/>
                         </pic:nvPicPr>
                         <pic:blipFill>
-                          <a:blip r:embed="rId16" cstate="print"/>
+                          <a:blip r:embed="rId12" cstate="print"/>
                           <a:stretch>
                             <a:fillRect/>
                           </a:stretch>
@@ -3564,7 +3415,7 @@
                           <pic:cNvPicPr/>
                         </pic:nvPicPr>
                         <pic:blipFill>
-                          <a:blip r:embed="rId17" cstate="print"/>
+                          <a:blip r:embed="rId13" cstate="print"/>
                           <a:stretch>
                             <a:fillRect/>
                           </a:stretch>
@@ -3585,7 +3436,7 @@
                           <pic:cNvPicPr/>
                         </pic:nvPicPr>
                         <pic:blipFill>
-                          <a:blip r:embed="rId18" cstate="print"/>
+                          <a:blip r:embed="rId14" cstate="print"/>
                           <a:stretch>
                             <a:fillRect/>
                           </a:stretch>
@@ -3606,7 +3457,7 @@
                           <pic:cNvPicPr/>
                         </pic:nvPicPr>
                         <pic:blipFill>
-                          <a:blip r:embed="rId19" cstate="print"/>
+                          <a:blip r:embed="rId15" cstate="print"/>
                           <a:stretch>
                             <a:fillRect/>
                           </a:stretch>
@@ -3627,7 +3478,7 @@
                           <pic:cNvPicPr/>
                         </pic:nvPicPr>
                         <pic:blipFill>
-                          <a:blip r:embed="rId20" cstate="print"/>
+                          <a:blip r:embed="rId16" cstate="print"/>
                           <a:stretch>
                             <a:fillRect/>
                           </a:stretch>
@@ -3694,7 +3545,7 @@
                           <pic:cNvPicPr/>
                         </pic:nvPicPr>
                         <pic:blipFill>
-                          <a:blip r:embed="rId21" cstate="print"/>
+                          <a:blip r:embed="rId17" cstate="print"/>
                           <a:stretch>
                             <a:fillRect/>
                           </a:stretch>
@@ -3715,7 +3566,7 @@
                           <pic:cNvPicPr/>
                         </pic:nvPicPr>
                         <pic:blipFill>
-                          <a:blip r:embed="rId22" cstate="print"/>
+                          <a:blip r:embed="rId18" cstate="print"/>
                           <a:stretch>
                             <a:fillRect/>
                           </a:stretch>
@@ -3736,7 +3587,7 @@
                           <pic:cNvPicPr/>
                         </pic:nvPicPr>
                         <pic:blipFill>
-                          <a:blip r:embed="rId23" cstate="print"/>
+                          <a:blip r:embed="rId19" cstate="print"/>
                           <a:stretch>
                             <a:fillRect/>
                           </a:stretch>
@@ -3803,7 +3654,7 @@
                           <pic:cNvPicPr/>
                         </pic:nvPicPr>
                         <pic:blipFill>
-                          <a:blip r:embed="rId24" cstate="print"/>
+                          <a:blip r:embed="rId20" cstate="print"/>
                           <a:stretch>
                             <a:fillRect/>
                           </a:stretch>
@@ -4104,27 +3955,6 @@
                           <a:noAutofit/>
                         </wps:bodyPr>
                       </wps:wsp>
-                      <pic:pic xmlns:pic="http://schemas.openxmlformats.org/drawingml/2006/picture">
-                        <pic:nvPicPr>
-                          <pic:cNvPr id="35" name="Image 35"/>
-                          <pic:cNvPicPr/>
-                        </pic:nvPicPr>
-                        <pic:blipFill>
-                          <a:blip r:embed="rId11" cstate="print"/>
-                          <a:stretch>
-                            <a:fillRect/>
-                          </a:stretch>
-                        </pic:blipFill>
-                        <pic:spPr>
-                          <a:xfrm>
-                            <a:off x="691123" y="4712340"/>
-                            <a:ext cx="117662" cy="117643"/>
-                          </a:xfrm>
-                          <a:prstGeom prst="rect">
-                            <a:avLst/>
-                          </a:prstGeom>
-                        </pic:spPr>
-                      </pic:pic>
                       <wps:wsp>
                         <wps:cNvPr id="36" name="Graphic 36"/>
                         <wps:cNvSpPr/>
@@ -4192,6 +4022,9 @@
                     </wpg:wgp>
                   </a:graphicData>
                 </a:graphic>
+                <wp14:sizeRelH relativeFrom="margin">
+                  <wp14:pctWidth>0</wp14:pctWidth>
+                </wp14:sizeRelH>
                 <wp14:sizeRelV relativeFrom="margin">
                   <wp14:pctHeight>0</wp14:pctHeight>
                 </wp14:sizeRelV>
@@ -4200,7 +4033,7 @@
           </mc:Choice>
           <mc:Fallback>
             <w:pict>
-              <v:group w14:anchorId="796347B6" id="Group 1" o:spid="_x0000_s1026" style="position:absolute;margin-left:0;margin-top:0;width:595.1pt;height:841.85pt;z-index:-251658232;mso-wrap-distance-left:0;mso-wrap-distance-right:0;mso-position-horizontal-relative:page;mso-position-vertical-relative:page;mso-height-relative:margin" coordsize="75579,106920" o:gfxdata="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